<commit_message>
docs(UseCase): updated UseCase document
</commit_message>
<xml_diff>
--- a/docs/02 Use Case Model.docx
+++ b/docs/02 Use Case Model.docx
@@ -477,7 +477,7 @@
               <w:spacing w:before="240" w:after="240"/>
             </w:pPr>
             <w:r>
-              <w:t xml:space="preserve"> </w:t>
+              <w:t>16/05/2026</w:t>
             </w:r>
           </w:p>
         </w:tc>
@@ -502,7 +502,7 @@
               <w:spacing w:before="240" w:after="240"/>
             </w:pPr>
             <w:r>
-              <w:t xml:space="preserve"> </w:t>
+              <w:t>2.0</w:t>
             </w:r>
           </w:p>
         </w:tc>
@@ -527,7 +527,7 @@
               <w:spacing w:before="240" w:after="240"/>
             </w:pPr>
             <w:r>
-              <w:t xml:space="preserve"> </w:t>
+              <w:t>Final version</w:t>
             </w:r>
           </w:p>
         </w:tc>
@@ -550,9 +550,18 @@
           <w:p>
             <w:pPr>
               <w:spacing w:before="240" w:after="240"/>
-            </w:pPr>
-            <w:r>
-              <w:t xml:space="preserve"> </w:t>
+              <w:rPr>
+                <w:lang w:val="en-US"/>
+              </w:rPr>
+            </w:pPr>
+            <w:r>
+              <w:t>Mule</w:t>
+            </w:r>
+            <w:r>
+              <w:rPr>
+                <w:lang w:val="en-US"/>
+              </w:rPr>
+              <w:t>ș Alexandru</w:t>
             </w:r>
           </w:p>
         </w:tc>
@@ -3939,6 +3948,7 @@
       <w:bookmarkStart w:id="1" w:name="_qylc318ei5ju" w:colFirst="0" w:colLast="0"/>
       <w:bookmarkEnd w:id="1"/>
       <w:r>
+        <w:lastRenderedPageBreak/>
         <w:t>2. UML Use Case Diagrams</w:t>
       </w:r>
     </w:p>
@@ -3951,14 +3961,13 @@
       </w:pPr>
       <w:r>
         <w:rPr>
-          <w:noProof/>
           <w:lang w:val="en-US"/>
         </w:rPr>
         <w:drawing>
-          <wp:inline distT="0" distB="0" distL="0" distR="0" wp14:anchorId="6FEEBA94" wp14:editId="06CB2AC2">
-            <wp:extent cx="3581306" cy="3970020"/>
-            <wp:effectExtent l="0" t="0" r="635" b="0"/>
-            <wp:docPr id="1710133977" name="Picture 2"/>
+          <wp:inline distT="0" distB="0" distL="0" distR="0" wp14:anchorId="27CF17ED" wp14:editId="7CFF19BD">
+            <wp:extent cx="5584666" cy="8098972"/>
+            <wp:effectExtent l="0" t="0" r="0" b="0"/>
+            <wp:docPr id="158421054" name="Picture 1"/>
             <wp:cNvGraphicFramePr>
               <a:graphicFrameLocks xmlns:a="http://schemas.openxmlformats.org/drawingml/2006/main" noChangeAspect="1"/>
             </wp:cNvGraphicFramePr>
@@ -3966,13 +3975,13 @@
               <a:graphicData uri="http://schemas.openxmlformats.org/drawingml/2006/picture">
                 <pic:pic xmlns:pic="http://schemas.openxmlformats.org/drawingml/2006/picture">
                   <pic:nvPicPr>
-                    <pic:cNvPr id="0" name="Picture 3"/>
+                    <pic:cNvPr id="0" name="Picture 1"/>
                     <pic:cNvPicPr>
                       <a:picLocks noChangeAspect="1" noChangeArrowheads="1"/>
                     </pic:cNvPicPr>
                   </pic:nvPicPr>
                   <pic:blipFill>
-                    <a:blip r:embed="rId4">
+                    <a:blip r:embed="rId4" cstate="print">
                       <a:extLst>
                         <a:ext uri="{28A0092B-C50C-407E-A947-70E740481C1C}">
                           <a14:useLocalDpi xmlns:a14="http://schemas.microsoft.com/office/drawing/2010/main" val="0"/>
@@ -3987,7 +3996,7 @@
                   <pic:spPr bwMode="auto">
                     <a:xfrm>
                       <a:off x="0" y="0"/>
-                      <a:ext cx="3595026" cy="3985229"/>
+                      <a:ext cx="5627875" cy="8161634"/>
                     </a:xfrm>
                     <a:prstGeom prst="rect">
                       <a:avLst/>
@@ -4003,6 +4012,14 @@
           </wp:inline>
         </w:drawing>
       </w:r>
+    </w:p>
+    <w:p>
+      <w:pPr>
+        <w:jc w:val="center"/>
+        <w:rPr>
+          <w:lang w:val="en-US"/>
+        </w:rPr>
+      </w:pPr>
     </w:p>
     <w:sectPr>
       <w:pgSz w:w="11909" w:h="16834"/>
@@ -4531,7 +4548,6 @@
   <w:style w:type="character" w:default="1" w:styleId="DefaultParagraphFont">
     <w:name w:val="Default Paragraph Font"/>
     <w:uiPriority w:val="1"/>
-    <w:semiHidden/>
     <w:unhideWhenUsed/>
   </w:style>
   <w:style w:type="table" w:default="1" w:styleId="TableNormal">

</xml_diff>